<commit_message>
Add SHAP explanations for the XGBoost model
- Refactor main.py into load_data()/make_ridge_model()/make_xgb_model()
  so it can be imported without side effects (same output as before).
- Add shap_analysis.py: out-of-fold TreeSHAP on XGBoost, matching the
  same 5-fold split used for evaluation. Writes per-player SHAP values
  for all 1,393 players, global importance/beeswarm plots, and
  waterfall charts + CSVs for the top-10 undervalued/overvalued
  players. Supports --player "Name" for an on-demand chart.
- Update documentation.docx (this branch only) with a new "Explaining
  Predictions (SHAP)" section covering method, global importance, and
  the key finding that both top-10 lists are driven almost entirely
  by club strength and age rather than individual stats.
- Update README with a short SHAP usage section.

Co-Authored-By: Claude Sonnet 5 <noreply@anthropic.com>
</commit_message>
<xml_diff>
--- a/documentation.docx
+++ b/documentation.docx
@@ -7503,7 +7503,24 @@
         <w:spacing w:after="160" w:before="320"/>
       </w:pPr>
       <w:r>
-        <w:t xml:space="preserve">8. Known Limitations</w:t>
+        <w:t xml:space="preserve">8. Explaining Predictions (SHAP)</w:t>
+      </w:r>
+    </w:p>
+    <w:p>
+      <w:pPr>
+        <w:spacing w:after="120"/>
+      </w:pPr>
+      <w:r>
+        <w:t xml:space="preserve">To check whether the XGBoost model's predictions - and in particular the undervalued/overvalued rankings above - rest on believable reasoning rather than a fluke of one feature, each prediction was broken down into a per-feature contribution using SHAP (SHapley Additive exPlanations).</w:t>
+      </w:r>
+    </w:p>
+    <w:p>
+      <w:pPr>
+        <w:pStyle w:val="Heading2"/>
+        <w:spacing w:after="120" w:before="240"/>
+      </w:pPr>
+      <w:r>
+        <w:t xml:space="preserve">8.1 Method</w:t>
       </w:r>
     </w:p>
     <w:p>
@@ -7516,7 +7533,7 @@
         <w:spacing w:after="60"/>
       </w:pPr>
       <w:r>
-        <w:t xml:space="preserve">No assists, expected assists (xA), or key-pass data exists in any of the three source files — confirmed by listing all 42 columns of the raw stats file. This is the single biggest gap for attacking positions.</w:t>
+        <w:t xml:space="preserve">TreeSHAP (exact, not approximated) run on XGBoost only - Ridge's contributions would just be coefficient × (feature - average), which adds no information beyond the coefficients themselves.</w:t>
       </w:r>
     </w:p>
     <w:p>
@@ -7529,7 +7546,7 @@
         <w:spacing w:after="60"/>
       </w:pPr>
       <w:r>
-        <w:t xml:space="preserve">No goalkeepers: the stats file has no goalkeeping-specific columns, so keepers are entirely absent from the dataset.</w:t>
+        <w:t xml:space="preserve">Computed out-of-fold: for each of the same 5 folds used for evaluation, a model trained on the other 4 folds explains that fold's held-out players. This matches how the undervalued/overvalued rankings are produced - no player is ever explained by a model that saw them during training.</w:t>
       </w:r>
     </w:p>
     <w:p>
@@ -7542,7 +7559,7 @@
         <w:spacing w:after="60"/>
       </w:pPr>
       <w:r>
-        <w:t xml:space="preserve">Superstar premium not modeled: the model has no way to represent reputation, hype, or sell-on potential, so it systematically under-predicts the very top of the market (see 7.4). The model's scope is explicitly limited to €1.8m–€40m for this reason.</w:t>
+        <w:t xml:space="preserve">Values are on the log scale the model is trained on (same scale as Section 6.3), one column per feature - including each one-hot League/Position dummy separately, with no grouping or conversion to euro multipliers.</w:t>
       </w:r>
     </w:p>
     <w:p>
@@ -7555,7 +7572,147 @@
         <w:spacing w:after="60"/>
       </w:pPr>
       <w:r>
-        <w:t xml:space="preserve">Snapshot mismatch: scraped age/club/contract/value reflect “today”, while performance stats reflect the season they were recorded. Around 40 of the original 378 players had since transferred to a different league; this was measured (a RECENTLY_TRANSFERRED flag) but not found to affect accuracy, so no correction was applied.</w:t>
+        <w:t xml:space="preserve">Additivity was verified for every player: base value + sum of that player's SHAP values reproduces the model's raw output to within 1e-4.</w:t>
+      </w:r>
+    </w:p>
+    <w:p>
+      <w:pPr>
+        <w:spacing w:after="120"/>
+      </w:pPr>
+      <w:r>
+        <w:rPr>
+          <w:b/>
+          <w:bCs/>
+        </w:rPr>
+        <w:t xml:space="preserve">Outputs: </w:t>
+      </w:r>
+      <w:r>
+        <w:t xml:space="preserve">outputs/shap/shap_values_all_players.csv (every player, every feature), global_importance_bar.png / global_beeswarm.png (below), and a waterfall chart + CSV for each of the top-10 undervalued and top-10 overvalued players from Sections 7.5-7.6.</w:t>
+      </w:r>
+    </w:p>
+    <w:p>
+      <w:pPr>
+        <w:pStyle w:val="Heading2"/>
+        <w:spacing w:after="120" w:before="240"/>
+      </w:pPr>
+      <w:r>
+        <w:t xml:space="preserve">8.2 Global feature importance</w:t>
+      </w:r>
+    </w:p>
+    <w:p>
+      <w:pPr>
+        <w:spacing w:after="120"/>
+      </w:pPr>
+      <w:r>
+        <w:t xml:space="preserve">Ranked by mean absolute SHAP value across all 1,393 players - i.e. how much each feature moves a typical prediction, in either direction:</w:t>
+      </w:r>
+    </w:p>
+    <w:p>
+      <w:pPr>
+        <w:spacing w:after="200"/>
+        <w:jc w:val="center"/>
+      </w:pPr>
+      <w:r>
+        <w:drawing>
+          <wp:inline distT="0" distB="0" distL="0" distR="0">
+            <wp:extent cx="4095750" cy="4867275"/>
+            <wp:effectExtent t="0" r="0" b="0" l="0"/>
+            <wp:docPr id="1" name="" descr="" title=""/>
+            <wp:cNvGraphicFramePr>
+              <a:graphicFrameLocks xmlns:a="http://schemas.openxmlformats.org/drawingml/2006/main" noChangeAspect="1"/>
+            </wp:cNvGraphicFramePr>
+            <a:graphic xmlns:a="http://schemas.openxmlformats.org/drawingml/2006/main">
+              <a:graphicData uri="http://schemas.openxmlformats.org/drawingml/2006/picture">
+                <pic:pic xmlns:pic="http://schemas.openxmlformats.org/drawingml/2006/picture">
+                  <pic:nvPicPr>
+                    <pic:cNvPr id="0" name="" descr=""/>
+                    <pic:cNvPicPr>
+                      <a:picLocks noChangeAspect="1" noChangeArrowheads="1"/>
+                    </pic:cNvPicPr>
+                  </pic:nvPicPr>
+                  <pic:blipFill>
+                    <a:blip r:embed="rId7" cstate="none"/>
+                    <a:srcRect/>
+                    <a:stretch>
+                      <a:fillRect/>
+                    </a:stretch>
+                  </pic:blipFill>
+                  <pic:spPr bwMode="auto">
+                    <a:xfrm>
+                      <a:off x="0" y="0"/>
+                      <a:ext cx="4095750" cy="4867275"/>
+                    </a:xfrm>
+                    <a:prstGeom prst="rect">
+                      <a:avLst/>
+                    </a:prstGeom>
+                  </pic:spPr>
+                </pic:pic>
+              </a:graphicData>
+            </a:graphic>
+          </wp:inline>
+        </w:drawing>
+      </w:r>
+    </w:p>
+    <w:p>
+      <w:pPr>
+        <w:spacing w:after="120"/>
+      </w:pPr>
+      <w:r>
+        <w:t xml:space="preserve">Club strength dominates, followed by age and total minutes played. This lines up with Section 7: features that are broad proxies for reputation and playing time outweigh any individual performance stat.</w:t>
+      </w:r>
+    </w:p>
+    <w:p>
+      <w:pPr>
+        <w:spacing w:after="120"/>
+      </w:pPr>
+      <w:r>
+        <w:t xml:space="preserve">The beeswarm view below adds direction: each dot is one player, colored by that player's own value for the feature, positioned by the SHAP value (the push on the prediction).</w:t>
+      </w:r>
+    </w:p>
+    <w:p>
+      <w:pPr>
+        <w:spacing w:after="200"/>
+        <w:jc w:val="center"/>
+      </w:pPr>
+      <w:r>
+        <w:drawing>
+          <wp:inline distT="0" distB="0" distL="0" distR="0">
+            <wp:extent cx="4095750" cy="4867275"/>
+            <wp:effectExtent t="0" r="0" b="0" l="0"/>
+            <wp:docPr id="1" name="" descr="" title=""/>
+            <wp:cNvGraphicFramePr>
+              <a:graphicFrameLocks xmlns:a="http://schemas.openxmlformats.org/drawingml/2006/main" noChangeAspect="1"/>
+            </wp:cNvGraphicFramePr>
+            <a:graphic xmlns:a="http://schemas.openxmlformats.org/drawingml/2006/main">
+              <a:graphicData uri="http://schemas.openxmlformats.org/drawingml/2006/picture">
+                <pic:pic xmlns:pic="http://schemas.openxmlformats.org/drawingml/2006/picture">
+                  <pic:nvPicPr>
+                    <pic:cNvPr id="0" name="" descr=""/>
+                    <pic:cNvPicPr>
+                      <a:picLocks noChangeAspect="1" noChangeArrowheads="1"/>
+                    </pic:cNvPicPr>
+                  </pic:nvPicPr>
+                  <pic:blipFill>
+                    <a:blip r:embed="rId8" cstate="none"/>
+                    <a:srcRect/>
+                    <a:stretch>
+                      <a:fillRect/>
+                    </a:stretch>
+                  </pic:blipFill>
+                  <pic:spPr bwMode="auto">
+                    <a:xfrm>
+                      <a:off x="0" y="0"/>
+                      <a:ext cx="4095750" cy="4867275"/>
+                    </a:xfrm>
+                    <a:prstGeom prst="rect">
+                      <a:avLst/>
+                    </a:prstGeom>
+                  </pic:spPr>
+                </pic:pic>
+              </a:graphicData>
+            </a:graphic>
+          </wp:inline>
+        </w:drawing>
       </w:r>
     </w:p>
     <w:p>
@@ -7568,7 +7725,7 @@
         <w:spacing w:after="60"/>
       </w:pPr>
       <w:r>
-        <w:t xml:space="preserve">103 of 1,813 players (11 original + 92 new) have no contract-expiry date on Transfermarkt and get the column median imputed.</w:t>
+        <w:t xml:space="preserve">Higher club strength (red) pushes value up; playing for a weaker club (blue) pushes it down - the single strongest effect in the model.</w:t>
       </w:r>
     </w:p>
     <w:p>
@@ -7581,7 +7738,7 @@
         <w:spacing w:after="60"/>
       </w:pPr>
       <w:r>
-        <w:t xml:space="preserve">1 player (Facundo Garcés) has no market value on Transfermarkt at all and is excluded from the dataset entirely.</w:t>
+        <w:t xml:space="preserve">Age behaves as expected from the spline: younger players (blue) are pushed up, older players (red) are pushed down.</w:t>
       </w:r>
     </w:p>
     <w:p>
@@ -7594,7 +7751,65 @@
         <w:spacing w:after="60"/>
       </w:pPr>
       <w:r>
-        <w:t xml:space="preserve">“Without club” free agents (23 players) get CLUB_STRENGTH = 0 rather than an imputed value, since that is a real fact about them.</w:t>
+        <w:t xml:space="preserve">More minutes played push value up, confirming durability/manager trust is a real signal distinct from per-90 stat quality.</w:t>
+      </w:r>
+    </w:p>
+    <w:p>
+      <w:pPr>
+        <w:pStyle w:val="Heading2"/>
+        <w:spacing w:after="120" w:before="240"/>
+      </w:pPr>
+      <w:r>
+        <w:t xml:space="preserve">8.3 Reading the undervalued/overvalued lists through SHAP</w:t>
+      </w:r>
+    </w:p>
+    <w:p>
+      <w:pPr>
+        <w:spacing w:after="120"/>
+      </w:pPr>
+      <w:r>
+        <w:t xml:space="preserve">Breaking down the top-10 lists from Sections 7.5 and 7.6 by their top two SHAP contributors shows a consistent, and important, pattern:</w:t>
+      </w:r>
+    </w:p>
+    <w:p>
+      <w:pPr>
+        <w:pStyle w:val="ListParagraph"/>
+        <w:numPr>
+          <w:ilvl w:val="0"/>
+          <w:numId w:val="1"/>
+        </w:numPr>
+        <w:spacing w:after="60"/>
+      </w:pPr>
+      <w:r>
+        <w:t xml:space="preserve">All 10 "most undervalued" players are pushed up almost entirely by CLUB_STRENGTH and Age - i.e. they are young players at strong clubs. Not one of them is flagged primarily because of an attacking or defensive stat.</w:t>
+      </w:r>
+    </w:p>
+    <w:p>
+      <w:pPr>
+        <w:pStyle w:val="ListParagraph"/>
+        <w:numPr>
+          <w:ilvl w:val="0"/>
+          <w:numId w:val="1"/>
+        </w:numPr>
+        <w:spacing w:after="60"/>
+      </w:pPr>
+      <w:r>
+        <w:t xml:space="preserve">9 of the 10 "most overvalued" players are pushed down primarily by CLUB_STRENGTH (playing for a comparatively weaker club than their price would suggest), sometimes combined with Age.</w:t>
+      </w:r>
+    </w:p>
+    <w:p>
+      <w:pPr>
+        <w:spacing w:after="120"/>
+      </w:pPr>
+      <w:r>
+        <w:rPr>
+          <w:b/>
+          <w:bCs/>
+        </w:rPr>
+        <w:t xml:space="preserve">Practical reading: </w:t>
+      </w:r>
+      <w:r>
+        <w:t xml:space="preserve">these two rankings are best understood as "players at strong clubs whose individual market value hasn't caught up to their club's level" (undervalued) and "players commanding prices above what their current club's level would suggest" (overvalued) - not as a broad, stats-driven verdict on performance. A player near the top of either list is worth a second look specifically at the club-strength/age angle, not automatically at their full stat line.</w:t>
       </w:r>
     </w:p>
     <w:p>
@@ -7603,7 +7818,120 @@
         <w:spacing w:after="160" w:before="320"/>
       </w:pPr>
       <w:r>
-        <w:t xml:space="preserve">9. Repository Structure &amp; Reproduction</w:t>
+        <w:t xml:space="preserve">9. Known Limitations</w:t>
+      </w:r>
+    </w:p>
+    <w:p>
+      <w:pPr>
+        <w:pStyle w:val="ListParagraph"/>
+        <w:numPr>
+          <w:ilvl w:val="0"/>
+          <w:numId w:val="1"/>
+        </w:numPr>
+        <w:spacing w:after="60"/>
+      </w:pPr>
+      <w:r>
+        <w:t xml:space="preserve">No assists, expected assists (xA), or key-pass data exists in any of the three source files — confirmed by listing all 42 columns of the raw stats file. This is the single biggest gap for attacking positions.</w:t>
+      </w:r>
+    </w:p>
+    <w:p>
+      <w:pPr>
+        <w:pStyle w:val="ListParagraph"/>
+        <w:numPr>
+          <w:ilvl w:val="0"/>
+          <w:numId w:val="1"/>
+        </w:numPr>
+        <w:spacing w:after="60"/>
+      </w:pPr>
+      <w:r>
+        <w:t xml:space="preserve">No goalkeepers: the stats file has no goalkeeping-specific columns, so keepers are entirely absent from the dataset.</w:t>
+      </w:r>
+    </w:p>
+    <w:p>
+      <w:pPr>
+        <w:pStyle w:val="ListParagraph"/>
+        <w:numPr>
+          <w:ilvl w:val="0"/>
+          <w:numId w:val="1"/>
+        </w:numPr>
+        <w:spacing w:after="60"/>
+      </w:pPr>
+      <w:r>
+        <w:t xml:space="preserve">Superstar premium not modeled: the model has no way to represent reputation, hype, or sell-on potential, so it systematically under-predicts the very top of the market (see 7.4). The model's scope is explicitly limited to €1.8m–€40m for this reason.</w:t>
+      </w:r>
+    </w:p>
+    <w:p>
+      <w:pPr>
+        <w:pStyle w:val="ListParagraph"/>
+        <w:numPr>
+          <w:ilvl w:val="0"/>
+          <w:numId w:val="1"/>
+        </w:numPr>
+        <w:spacing w:after="60"/>
+      </w:pPr>
+      <w:r>
+        <w:t xml:space="preserve">Snapshot mismatch: scraped age/club/contract/value reflect “today”, while performance stats reflect the season they were recorded. Around 40 of the original 378 players had since transferred to a different league; this was measured (a RECENTLY_TRANSFERRED flag) but not found to affect accuracy, so no correction was applied.</w:t>
+      </w:r>
+    </w:p>
+    <w:p>
+      <w:pPr>
+        <w:pStyle w:val="ListParagraph"/>
+        <w:numPr>
+          <w:ilvl w:val="0"/>
+          <w:numId w:val="1"/>
+        </w:numPr>
+        <w:spacing w:after="60"/>
+      </w:pPr>
+      <w:r>
+        <w:t xml:space="preserve">103 of 1,813 players (11 original + 92 new) have no contract-expiry date on Transfermarkt and get the column median imputed.</w:t>
+      </w:r>
+    </w:p>
+    <w:p>
+      <w:pPr>
+        <w:pStyle w:val="ListParagraph"/>
+        <w:numPr>
+          <w:ilvl w:val="0"/>
+          <w:numId w:val="1"/>
+        </w:numPr>
+        <w:spacing w:after="60"/>
+      </w:pPr>
+      <w:r>
+        <w:t xml:space="preserve">1 player (Facundo Garcés) has no market value on Transfermarkt at all and is excluded from the dataset entirely.</w:t>
+      </w:r>
+    </w:p>
+    <w:p>
+      <w:pPr>
+        <w:pStyle w:val="ListParagraph"/>
+        <w:numPr>
+          <w:ilvl w:val="0"/>
+          <w:numId w:val="1"/>
+        </w:numPr>
+        <w:spacing w:after="60"/>
+      </w:pPr>
+      <w:r>
+        <w:t xml:space="preserve">“Without club” free agents (23 players) get CLUB_STRENGTH = 0 rather than an imputed value, since that is a real fact about them.</w:t>
+      </w:r>
+    </w:p>
+    <w:p>
+      <w:pPr>
+        <w:pStyle w:val="ListParagraph"/>
+        <w:numPr>
+          <w:ilvl w:val="0"/>
+          <w:numId w:val="1"/>
+        </w:numPr>
+        <w:spacing w:after="60"/>
+      </w:pPr>
+      <w:r>
+        <w:t xml:space="preserve">SHAP explains why the model predicted a given value, not why the market disagrees with it - the actual-vs-predicted gap is exactly the part the model can't see. Correlated stats (the various passing/carrying columns) can split credit between themselves somewhat arbitrarily, and a contribution reflects a learned association, not a causal effect.</w:t>
+      </w:r>
+    </w:p>
+    <w:p>
+      <w:pPr>
+        <w:pStyle w:val="Heading1"/>
+        <w:spacing w:after="160" w:before="320"/>
+      </w:pPr>
+      <w:r>
+        <w:t xml:space="preserve">10. Repository Structure &amp; Reproduction</w:t>
       </w:r>
     </w:p>
     <w:p>
@@ -8272,6 +8600,77 @@
                 <w:bCs w:val="false"/>
               </w:rPr>
               <w:t xml:space="preserve">Trains and evaluates Ridge + XGBoost; prints all metrics in Section 7.1</w:t>
+            </w:r>
+          </w:p>
+        </w:tc>
+      </w:tr>
+      <w:tr>
+        <w:tc>
+          <w:tcPr>
+            <w:tcW w:type="dxa" w:w="700"/>
+            <w:tcMar>
+              <w:top w:type="dxa" w:w="60"/>
+              <w:left w:type="dxa" w:w="100"/>
+              <w:bottom w:type="dxa" w:w="60"/>
+              <w:right w:type="dxa" w:w="100"/>
+            </w:tcMar>
+          </w:tcPr>
+          <w:p>
+            <w:pPr>
+              <w:jc w:val="left"/>
+            </w:pPr>
+            <w:r>
+              <w:rPr>
+                <w:b w:val="false"/>
+                <w:bCs w:val="false"/>
+              </w:rPr>
+              <w:t xml:space="preserve">9</w:t>
+            </w:r>
+          </w:p>
+        </w:tc>
+        <w:tc>
+          <w:tcPr>
+            <w:tcW w:type="dxa" w:w="3400"/>
+            <w:tcMar>
+              <w:top w:type="dxa" w:w="60"/>
+              <w:left w:type="dxa" w:w="100"/>
+              <w:bottom w:type="dxa" w:w="60"/>
+              <w:right w:type="dxa" w:w="100"/>
+            </w:tcMar>
+          </w:tcPr>
+          <w:p>
+            <w:pPr>
+              <w:jc w:val="left"/>
+            </w:pPr>
+            <w:r>
+              <w:rPr>
+                <w:b w:val="false"/>
+                <w:bCs w:val="false"/>
+              </w:rPr>
+              <w:t xml:space="preserve">shap_analysis.py</w:t>
+            </w:r>
+          </w:p>
+        </w:tc>
+        <w:tc>
+          <w:tcPr>
+            <w:tcW w:type="dxa" w:w="5800"/>
+            <w:tcMar>
+              <w:top w:type="dxa" w:w="60"/>
+              <w:left w:type="dxa" w:w="100"/>
+              <w:bottom w:type="dxa" w:w="60"/>
+              <w:right w:type="dxa" w:w="100"/>
+            </w:tcMar>
+          </w:tcPr>
+          <w:p>
+            <w:pPr>
+              <w:jc w:val="left"/>
+            </w:pPr>
+            <w:r>
+              <w:rPr>
+                <w:b w:val="false"/>
+                <w:bCs w:val="false"/>
+              </w:rPr>
+              <w:t xml:space="preserve">Out-of-fold SHAP explanations; writes outputs/shap/ (Section 8)</w:t>
             </w:r>
           </w:p>
         </w:tc>

</xml_diff>